<commit_message>
Alteração atividade parte 1
</commit_message>
<xml_diff>
--- a/Obsevação - 11.03.26.docx
+++ b/Obsevação - 11.03.26.docx
@@ -5,6 +5,62 @@
     <w:p>
       <w:r>
         <w:t>Requisitos adicionais – AutoPark System</w:t>
+      </w:r>
+    </w:p>
+    <w:p/>
+    <w:p>
+      <w:r>
+        <w:t>Estacionamentos com elevadores</w:t>
+      </w:r>
+    </w:p>
+    <w:p>
+      <w:r>
+        <w:t>Vantagens: melhor organização dos veículos, sistema inteligente que não necessita de manobrista, verificação de disponibilidade de vagas.</w:t>
+      </w:r>
+    </w:p>
+    <w:p>
+      <w:r>
+        <w:t>Desvantagens: eleva o custo do projeto, necessita de um desenvolvimento mais robusto do sistema, preocupação com manutenções mecânicas.</w:t>
+      </w:r>
+    </w:p>
+    <w:p/>
+    <w:p>
+      <w:r>
+        <w:t>Estacionamentos com robôs:</w:t>
+      </w:r>
+    </w:p>
+    <w:p>
+      <w:r>
+        <w:t>Vantagens: seleciona a melhor vaga de acordo com o tamanho do carro, não necessita de manobrista, sistema inteligente que mostra ao usuário onde o seu carro está estacionado.</w:t>
+      </w:r>
+    </w:p>
+    <w:p>
+      <w:r>
+        <w:t>Desvantagens: eleva o custo do projeto, desenvolvimento de sistema mais robusto, usuário necessita de tecnologia para interagir com o sistema.</w:t>
+      </w:r>
+    </w:p>
+    <w:p/>
+    <w:p>
+      <w:r>
+        <w:t>Barraca para os carros:</w:t>
+      </w:r>
+      <w:r>
+        <w:br/>
+        <w:t xml:space="preserve">Vantagens: não eleva o custo do projeto, fácil </w:t>
+      </w:r>
+      <w:r>
+        <w:t>instalação, não necessita um treinamento robusto para os funcionários.</w:t>
+      </w:r>
+    </w:p>
+    <w:p>
+      <w:r>
+        <w:t>Desvantagens: precisa ser instalado manualmente carro por carro, não protege 100%, em estacionamentos que são cobertos não existe a necessidade.</w:t>
+      </w:r>
+    </w:p>
+    <w:p/>
+    <w:p>
+      <w:r>
+        <w:t>Ideias para adicionar no AutoPark System:</w:t>
       </w:r>
     </w:p>
     <w:p>

</xml_diff>